<commit_message>
Accept LL21-a and choose B by dated project decision
</commit_message>
<xml_diff>
--- a/doc/WASM/CCL_WebAssembly_Acceptance_Policy_and_Regression_Register_v1_7.docx
+++ b/doc/WASM/CCL_WebAssembly_Acceptance_Policy_and_Regression_Register_v1_7.docx
@@ -926,7 +926,7 @@
     <w:p>
       <w:r>
         <w:rPr/>
-        <w:t xml:space="preserve">[D] Stage 0 Desk Decisions v1.8, 11 September 2026 Project authority for D1–D7. D3 remains open; D5 specifies owner-only CAS GC admission, typed entry identity and interruptible FOREIGN I/O. D7 maps authoritative LL stage slices into phased executable inventories, including S0-LL20-b. This is a decision/protocol source, not test-execution evidence. CCL_WebAssembly_Stage0_Desk_Decisions_v1_8.docx</w:t>
+        <w:t xml:space="preserve">[D] Stage 0 Desk Decisions v1.8, 11 September 2026 Project authority for D1–D7. D3 chooses B by the dated 12 September engineering amendment; D5 specifies owner-only CAS GC admission, typed entry identity and interruptible FOREIGN I/O. D7 maps authoritative LL stage slices into phased executable inventories, including S0-LL20-b. This is a decision/protocol source, not test-execution evidence. CCL_WebAssembly_Stage0_Desk_Decisions_v1_8.docx</w:t>
       </w:r>
     </w:p>
     <w:p>
@@ -1124,7 +1124,7 @@
     <w:p>
       <w:r>
         <w:rPr/>
-        <w:t xml:space="preserve">Required regression. Stages 0 and 1 exercise zero, one, two, three and overflow arguments with distinct values, subtraction and ordered side effects across direct and dynamic calls, closures, APPLY, optional/rest/keyword binding, primitive entries and host callbacks when in the closure, verifying count encoding and zero/one/many returns against the Stage 0-specified Wasm ABI. Qualify C, C4 and B before their baseline measurements. H(G) is a possible future enhancement and is not required for acceptance at any currently scheduled stage. [D, D3/D7]</w:t>
+        <w:t xml:space="preserve">Required regression. Stages 0 and 1 exercise zero, one, two, three and overflow arguments with distinct values, subtraction and ordered side effects across direct and dynamic calls, closures, APPLY, optional/rest/keyword binding, primitive entries and host callbacks when in the closure, verifying count encoding and zero/one/many returns against the Stage 0-specified Wasm ABI. Retain the qualified C/C4/B hand-built corpus and repeat the selected B protocol through generated code. Comparative timing is optional under the 12 September policy revision. H(G) is a possible future enhancement and is not required for acceptance at any currently scheduled stage. [D, D3/D7]</w:t>
       </w:r>
     </w:p>
     <w:p>
@@ -1661,7 +1661,7 @@
     <w:p>
       <w:r>
         <w:rPr/>
-        <w:t xml:space="preserve">Required regression. All stages emit build-bound module/function/code-ID maps and structured errors with phase, operation, expected/actual representation and relevant state; distinguish last observed activity from the faulting frame; bound diagnostic volume and retain first-error data; debug with minimal reproducers and disassembly; never mark a hypothesized diagnosis or prose-only fix complete. Stage 0 S0-LL23-b additionally proves the initial logical frame/source/lexical map and debug availability contract in contracts/debug-frames.md, including moving roots, suspension and nonlocal restoration. Stage 1 repeats with compiler-generated frames; Stage 3 exercises the real debugger. D3 charges the fixed-policy frame cost before ABI freeze.</w:t>
+        <w:t xml:space="preserve">Required regression. All stages emit build-bound module/function/code-ID maps and structured errors with phase, operation, expected/actual representation and relevant state; distinguish last observed activity from the faulting frame; bound diagnostic volume and retain first-error data; debug with minimal reproducers and disassembly; never mark a hypothesized diagnosis or prose-only fix complete. Stage 0 S0-LL23-b additionally proves the initial logical frame/source/lexical map and debug availability contract in contracts/debug-frames.md, including moving roots, suspension and nonlocal restoration. Stage 1 repeats with compiler-generated frames; Stage 3 exercises the real debugger. B retains the fixed-policy frame contract; future performance work charges its actual costs.</w:t>
       </w:r>
     </w:p>
     <w:p>

</xml_diff>